<commit_message>
Modifying the due date.
</commit_message>
<xml_diff>
--- a/projects/project04.docx
+++ b/projects/project04.docx
@@ -75,7 +75,15 @@
           <w:sz w:val="32"/>
           <w:szCs w:val="32"/>
         </w:rPr>
-        <w:t>25</w:t>
+        <w:t>2</w:t>
+      </w:r>
+      <w:r>
+        <w:rPr>
+          <w:b/>
+          <w:sz w:val="32"/>
+          <w:szCs w:val="32"/>
+        </w:rPr>
+        <w:t>4</w:t>
       </w:r>
       <w:r>
         <w:rPr>
@@ -148,21 +156,7 @@
         <w:rPr>
           <w:i/>
         </w:rPr>
-        <w:t xml:space="preserve">Attempt to get root </w:t>
-      </w:r>
-      <w:proofErr w:type="gramStart"/>
-      <w:r>
-        <w:rPr>
-          <w:i/>
-        </w:rPr>
-        <w:t>on</w:t>
-      </w:r>
-      <w:proofErr w:type="gramEnd"/>
-      <w:r>
-        <w:rPr>
-          <w:i/>
-        </w:rPr>
-        <w:t xml:space="preserve"> a CTF vulnerable virtual machine without documentation</w:t>
+        <w:t>Attempt to get root on a CTF vulnerable virtual machine without documentation</w:t>
       </w:r>
       <w:r>
         <w:rPr>
@@ -320,28 +314,18 @@
         <w:t xml:space="preserve"> and </w:t>
       </w:r>
       <w:hyperlink r:id="rId6" w:history="1">
-        <w:proofErr w:type="spellStart"/>
         <w:r>
           <w:rPr>
             <w:rStyle w:val="Hyperlink"/>
           </w:rPr>
           <w:t>sqlmap</w:t>
         </w:r>
-        <w:proofErr w:type="spellEnd"/>
       </w:hyperlink>
       <w:r>
         <w:t xml:space="preserve"> (with the --forms option)</w:t>
       </w:r>
       <w:r>
-        <w:t xml:space="preserve"> that you might want to check out.  Feel free to explore additional plugins with </w:t>
-      </w:r>
-      <w:proofErr w:type="spellStart"/>
-      <w:r>
-        <w:t>BurpSuite</w:t>
-      </w:r>
-      <w:proofErr w:type="spellEnd"/>
-      <w:r>
-        <w:t xml:space="preserve"> or </w:t>
+        <w:t xml:space="preserve"> that you might want to check out.  Feel free to explore additional plugins with BurpSuite or </w:t>
       </w:r>
       <w:r>
         <w:t>ZAP as well.</w:t>
@@ -436,13 +420,8 @@
       <w:r>
         <w:t xml:space="preserve"> </w:t>
       </w:r>
-      <w:proofErr w:type="gramStart"/>
-      <w:r>
-        <w:t>Base</w:t>
-      </w:r>
-      <w:proofErr w:type="gramEnd"/>
-      <w:r>
-        <w:t xml:space="preserve"> your report on the project 4 vulnerability analysis report template found in the class google folder.</w:t>
+      <w:r>
+        <w:t>Base your report on the project 4 vulnerability analysis report template found in the class google folder.</w:t>
       </w:r>
     </w:p>
     <w:p>
@@ -625,31 +604,7 @@
               </w:numPr>
             </w:pPr>
             <w:r>
-              <w:t xml:space="preserve">Cover reconnaissance with tools </w:t>
-            </w:r>
-            <w:proofErr w:type="spellStart"/>
-            <w:r>
-              <w:t>nmap</w:t>
-            </w:r>
-            <w:proofErr w:type="spellEnd"/>
-            <w:r>
-              <w:t xml:space="preserve">, </w:t>
-            </w:r>
-            <w:proofErr w:type="spellStart"/>
-            <w:r>
-              <w:t>nikto</w:t>
-            </w:r>
-            <w:proofErr w:type="spellEnd"/>
-            <w:r>
-              <w:t xml:space="preserve">, </w:t>
-            </w:r>
-            <w:proofErr w:type="spellStart"/>
-            <w:r>
-              <w:t>nessus</w:t>
-            </w:r>
-            <w:proofErr w:type="spellEnd"/>
-            <w:r>
-              <w:t xml:space="preserve">, and at least </w:t>
+              <w:t xml:space="preserve">Cover reconnaissance with tools nmap, nikto, nessus, and at least </w:t>
             </w:r>
             <w:r>
               <w:t>2</w:t>
@@ -669,23 +624,7 @@
               </w:numPr>
             </w:pPr>
             <w:r>
-              <w:t xml:space="preserve">For each reconnaissance method, don’t just copy and paste what the tool tells you.  I also expect a narrative of what it means.  (For example, what is the </w:t>
-            </w:r>
-            <w:proofErr w:type="spellStart"/>
-            <w:r>
-              <w:t>nmap</w:t>
-            </w:r>
-            <w:proofErr w:type="spellEnd"/>
-            <w:r>
-              <w:t xml:space="preserve"> readout telling us?)  For </w:t>
-            </w:r>
-            <w:proofErr w:type="spellStart"/>
-            <w:r>
-              <w:t>nessus</w:t>
-            </w:r>
-            <w:proofErr w:type="spellEnd"/>
-            <w:r>
-              <w:t xml:space="preserve">, please show and discuss all red and </w:t>
+              <w:t xml:space="preserve">For each reconnaissance method, don’t just copy and paste what the tool tells you.  I also expect a narrative of what it means.  (For example, what is the nmap readout telling us?)  For nessus, please show and discuss all red and </w:t>
             </w:r>
             <w:r>
               <w:t>orange/critical and high</w:t>
@@ -1099,15 +1038,7 @@
               </w:numPr>
             </w:pPr>
             <w:r>
-              <w:t xml:space="preserve">Gaining root access </w:t>
-            </w:r>
-            <w:proofErr w:type="gramStart"/>
-            <w:r>
-              <w:t>on</w:t>
-            </w:r>
-            <w:proofErr w:type="gramEnd"/>
-            <w:r>
-              <w:t xml:space="preserve"> the machine</w:t>
+              <w:t>Gaining root access on the machine</w:t>
             </w:r>
           </w:p>
           <w:p>

</xml_diff>